<commit_message>
feat: implement dynamic image scaling and aspect ratio preservation in docx generation script
</commit_message>
<xml_diff>
--- a/diagrams/KIPI_Drawings.docx
+++ b/diagrams/KIPI_Drawings.docx
@@ -89,7 +89,7 @@
       <w:r>
         <w:drawing>
           <wp:inline xmlns:a="http://schemas.openxmlformats.org/drawingml/2006/main" xmlns:pic="http://schemas.openxmlformats.org/drawingml/2006/picture">
-            <wp:extent cx="5760000" cy="28995080"/>
+            <wp:extent cx="1430311" cy="7200000"/>
             <wp:docPr id="2" name="Picture 2"/>
             <wp:cNvGraphicFramePr>
               <a:graphicFrameLocks noChangeAspect="1"/>
@@ -110,7 +110,7 @@
                   <pic:spPr>
                     <a:xfrm>
                       <a:off x="0" y="0"/>
-                      <a:ext cx="5760000" cy="28995080"/>
+                      <a:ext cx="1430311" cy="7200000"/>
                     </a:xfrm>
                     <a:prstGeom prst="rect"/>
                   </pic:spPr>
@@ -157,7 +157,7 @@
       <w:r>
         <w:drawing>
           <wp:inline xmlns:a="http://schemas.openxmlformats.org/drawingml/2006/main" xmlns:pic="http://schemas.openxmlformats.org/drawingml/2006/picture">
-            <wp:extent cx="5760000" cy="21136189"/>
+            <wp:extent cx="1962132" cy="7200000"/>
             <wp:docPr id="3" name="Picture 3"/>
             <wp:cNvGraphicFramePr>
               <a:graphicFrameLocks noChangeAspect="1"/>
@@ -178,7 +178,7 @@
                   <pic:spPr>
                     <a:xfrm>
                       <a:off x="0" y="0"/>
-                      <a:ext cx="5760000" cy="21136189"/>
+                      <a:ext cx="1962132" cy="7200000"/>
                     </a:xfrm>
                     <a:prstGeom prst="rect"/>
                   </pic:spPr>
@@ -225,7 +225,7 @@
       <w:r>
         <w:drawing>
           <wp:inline xmlns:a="http://schemas.openxmlformats.org/drawingml/2006/main" xmlns:pic="http://schemas.openxmlformats.org/drawingml/2006/picture">
-            <wp:extent cx="5760000" cy="16524429"/>
+            <wp:extent cx="2509738" cy="7200000"/>
             <wp:docPr id="4" name="Picture 4"/>
             <wp:cNvGraphicFramePr>
               <a:graphicFrameLocks noChangeAspect="1"/>
@@ -246,7 +246,7 @@
                   <pic:spPr>
                     <a:xfrm>
                       <a:off x="0" y="0"/>
-                      <a:ext cx="5760000" cy="16524429"/>
+                      <a:ext cx="2509738" cy="7200000"/>
                     </a:xfrm>
                     <a:prstGeom prst="rect"/>
                   </pic:spPr>
@@ -361,7 +361,7 @@
       <w:r>
         <w:drawing>
           <wp:inline xmlns:a="http://schemas.openxmlformats.org/drawingml/2006/main" xmlns:pic="http://schemas.openxmlformats.org/drawingml/2006/picture">
-            <wp:extent cx="5760000" cy="22141040"/>
+            <wp:extent cx="1873082" cy="7200000"/>
             <wp:docPr id="6" name="Picture 6"/>
             <wp:cNvGraphicFramePr>
               <a:graphicFrameLocks noChangeAspect="1"/>
@@ -382,7 +382,7 @@
                   <pic:spPr>
                     <a:xfrm>
                       <a:off x="0" y="0"/>
-                      <a:ext cx="5760000" cy="22141040"/>
+                      <a:ext cx="1873082" cy="7200000"/>
                     </a:xfrm>
                     <a:prstGeom prst="rect"/>
                   </pic:spPr>

</xml_diff>

<commit_message>
refactor: implement section-based page formatting with native headers and footers in generate_docx.py
</commit_message>
<xml_diff>
--- a/diagrams/KIPI_Drawings.docx
+++ b/diagrams/KIPI_Drawings.docx
@@ -2,18 +2,6 @@
 <file path=word/document.xml><?xml version="1.0" encoding="utf-8"?>
 <w:document xmlns:wpc="http://schemas.microsoft.com/office/word/2010/wordprocessingCanvas" xmlns:mo="http://schemas.microsoft.com/office/mac/office/2008/main" xmlns:mc="http://schemas.openxmlformats.org/markup-compatibility/2006" xmlns:mv="urn:schemas-microsoft-com:mac:vml" xmlns:o="urn:schemas-microsoft-com:office:office" xmlns:r="http://schemas.openxmlformats.org/officeDocument/2006/relationships" xmlns:m="http://schemas.openxmlformats.org/officeDocument/2006/math" xmlns:v="urn:schemas-microsoft-com:vml" xmlns:wp14="http://schemas.microsoft.com/office/word/2010/wordprocessingDrawing" xmlns:wp="http://schemas.openxmlformats.org/drawingml/2006/wordprocessingDrawing" xmlns:w10="urn:schemas-microsoft-com:office:word" xmlns:w="http://schemas.openxmlformats.org/wordprocessingml/2006/main" xmlns:w14="http://schemas.microsoft.com/office/word/2010/wordml" xmlns:wpg="http://schemas.microsoft.com/office/word/2010/wordprocessingGroup" xmlns:wpi="http://schemas.microsoft.com/office/word/2010/wordprocessingInk" xmlns:wne="http://schemas.microsoft.com/office/word/2006/wordml" xmlns:wps="http://schemas.microsoft.com/office/word/2010/wordprocessingShape" mc:Ignorable="w14 wp14">
   <w:body>
-    <w:p>
-      <w:pPr>
-        <w:jc w:val="right"/>
-      </w:pPr>
-      <w:r>
-        <w:rPr>
-          <w:rFonts w:ascii="Arial" w:hAnsi="Arial"/>
-          <w:sz w:val="24"/>
-        </w:rPr>
-        <w:t>1/6</w:t>
-      </w:r>
-    </w:p>
     <w:p>
       <w:pPr>
         <w:jc w:val="center"/>
@@ -21,7 +9,7 @@
       <w:r>
         <w:drawing>
           <wp:inline xmlns:a="http://schemas.openxmlformats.org/drawingml/2006/main" xmlns:pic="http://schemas.openxmlformats.org/drawingml/2006/picture">
-            <wp:extent cx="5760000" cy="2380408"/>
+            <wp:extent cx="5940000" cy="2454795"/>
             <wp:docPr id="1" name="Picture 1"/>
             <wp:cNvGraphicFramePr>
               <a:graphicFrameLocks noChangeAspect="1"/>
@@ -34,7 +22,7 @@
                     <pic:cNvPicPr/>
                   </pic:nvPicPr>
                   <pic:blipFill>
-                    <a:blip r:embed="rId9"/>
+                    <a:blip r:embed="rId11"/>
                     <a:stretch>
                       <a:fillRect/>
                     </a:stretch>
@@ -42,7 +30,7 @@
                   <pic:spPr>
                     <a:xfrm>
                       <a:off x="0" y="0"/>
-                      <a:ext cx="5760000" cy="2380408"/>
+                      <a:ext cx="5940000" cy="2454795"/>
                     </a:xfrm>
                     <a:prstGeom prst="rect"/>
                   </pic:spPr>
@@ -55,32 +43,15 @@
     </w:p>
     <w:p>
       <w:pPr>
-        <w:jc w:val="center"/>
+        <w:sectPr>
+          <w:headerReference w:type="default" r:id="rId9"/>
+          <w:footerReference w:type="default" r:id="rId10"/>
+          <w:pgSz w:w="11906" w:h="16838"/>
+          <w:pgMar w:top="1417" w:right="850" w:bottom="567" w:left="1417" w:header="720" w:footer="720" w:gutter="0"/>
+          <w:cols w:space="720"/>
+          <w:docGrid w:linePitch="360"/>
+        </w:sectPr>
       </w:pPr>
-      <w:r>
-        <w:rPr>
-          <w:rFonts w:ascii="Arial" w:hAnsi="Arial"/>
-          <w:sz w:val="24"/>
-        </w:rPr>
-        <w:t>Fig. 1</w:t>
-      </w:r>
-    </w:p>
-    <w:p>
-      <w:r>
-        <w:br w:type="page"/>
-      </w:r>
-    </w:p>
-    <w:p>
-      <w:pPr>
-        <w:jc w:val="right"/>
-      </w:pPr>
-      <w:r>
-        <w:rPr>
-          <w:rFonts w:ascii="Arial" w:hAnsi="Arial"/>
-          <w:sz w:val="24"/>
-        </w:rPr>
-        <w:t>2/6</w:t>
-      </w:r>
     </w:p>
     <w:p>
       <w:pPr>
@@ -89,7 +60,7 @@
       <w:r>
         <w:drawing>
           <wp:inline xmlns:a="http://schemas.openxmlformats.org/drawingml/2006/main" xmlns:pic="http://schemas.openxmlformats.org/drawingml/2006/picture">
-            <wp:extent cx="1430311" cy="7200000"/>
+            <wp:extent cx="1501827" cy="7560000"/>
             <wp:docPr id="2" name="Picture 2"/>
             <wp:cNvGraphicFramePr>
               <a:graphicFrameLocks noChangeAspect="1"/>
@@ -102,7 +73,7 @@
                     <pic:cNvPicPr/>
                   </pic:nvPicPr>
                   <pic:blipFill>
-                    <a:blip r:embed="rId10"/>
+                    <a:blip r:embed="rId14"/>
                     <a:stretch>
                       <a:fillRect/>
                     </a:stretch>
@@ -110,7 +81,7 @@
                   <pic:spPr>
                     <a:xfrm>
                       <a:off x="0" y="0"/>
-                      <a:ext cx="1430311" cy="7200000"/>
+                      <a:ext cx="1501827" cy="7560000"/>
                     </a:xfrm>
                     <a:prstGeom prst="rect"/>
                   </pic:spPr>
@@ -123,32 +94,15 @@
     </w:p>
     <w:p>
       <w:pPr>
-        <w:jc w:val="center"/>
+        <w:sectPr>
+          <w:headerReference w:type="default" r:id="rId12"/>
+          <w:footerReference w:type="default" r:id="rId13"/>
+          <w:pgSz w:w="11906" w:h="16838"/>
+          <w:pgMar w:top="1417" w:right="850" w:bottom="567" w:left="1417" w:header="720" w:footer="720" w:gutter="0"/>
+          <w:cols w:space="720"/>
+          <w:docGrid w:linePitch="360"/>
+        </w:sectPr>
       </w:pPr>
-      <w:r>
-        <w:rPr>
-          <w:rFonts w:ascii="Arial" w:hAnsi="Arial"/>
-          <w:sz w:val="24"/>
-        </w:rPr>
-        <w:t>Fig. 2</w:t>
-      </w:r>
-    </w:p>
-    <w:p>
-      <w:r>
-        <w:br w:type="page"/>
-      </w:r>
-    </w:p>
-    <w:p>
-      <w:pPr>
-        <w:jc w:val="right"/>
-      </w:pPr>
-      <w:r>
-        <w:rPr>
-          <w:rFonts w:ascii="Arial" w:hAnsi="Arial"/>
-          <w:sz w:val="24"/>
-        </w:rPr>
-        <w:t>3/6</w:t>
-      </w:r>
     </w:p>
     <w:p>
       <w:pPr>
@@ -157,7 +111,7 @@
       <w:r>
         <w:drawing>
           <wp:inline xmlns:a="http://schemas.openxmlformats.org/drawingml/2006/main" xmlns:pic="http://schemas.openxmlformats.org/drawingml/2006/picture">
-            <wp:extent cx="1962132" cy="7200000"/>
+            <wp:extent cx="2060238" cy="7560000"/>
             <wp:docPr id="3" name="Picture 3"/>
             <wp:cNvGraphicFramePr>
               <a:graphicFrameLocks noChangeAspect="1"/>
@@ -170,7 +124,7 @@
                     <pic:cNvPicPr/>
                   </pic:nvPicPr>
                   <pic:blipFill>
-                    <a:blip r:embed="rId11"/>
+                    <a:blip r:embed="rId17"/>
                     <a:stretch>
                       <a:fillRect/>
                     </a:stretch>
@@ -178,7 +132,7 @@
                   <pic:spPr>
                     <a:xfrm>
                       <a:off x="0" y="0"/>
-                      <a:ext cx="1962132" cy="7200000"/>
+                      <a:ext cx="2060238" cy="7560000"/>
                     </a:xfrm>
                     <a:prstGeom prst="rect"/>
                   </pic:spPr>
@@ -191,32 +145,15 @@
     </w:p>
     <w:p>
       <w:pPr>
-        <w:jc w:val="center"/>
+        <w:sectPr>
+          <w:headerReference w:type="default" r:id="rId15"/>
+          <w:footerReference w:type="default" r:id="rId16"/>
+          <w:pgSz w:w="11906" w:h="16838"/>
+          <w:pgMar w:top="1417" w:right="850" w:bottom="567" w:left="1417" w:header="720" w:footer="720" w:gutter="0"/>
+          <w:cols w:space="720"/>
+          <w:docGrid w:linePitch="360"/>
+        </w:sectPr>
       </w:pPr>
-      <w:r>
-        <w:rPr>
-          <w:rFonts w:ascii="Arial" w:hAnsi="Arial"/>
-          <w:sz w:val="24"/>
-        </w:rPr>
-        <w:t>Fig. 3</w:t>
-      </w:r>
-    </w:p>
-    <w:p>
-      <w:r>
-        <w:br w:type="page"/>
-      </w:r>
-    </w:p>
-    <w:p>
-      <w:pPr>
-        <w:jc w:val="right"/>
-      </w:pPr>
-      <w:r>
-        <w:rPr>
-          <w:rFonts w:ascii="Arial" w:hAnsi="Arial"/>
-          <w:sz w:val="24"/>
-        </w:rPr>
-        <w:t>4/6</w:t>
-      </w:r>
     </w:p>
     <w:p>
       <w:pPr>
@@ -225,7 +162,7 @@
       <w:r>
         <w:drawing>
           <wp:inline xmlns:a="http://schemas.openxmlformats.org/drawingml/2006/main" xmlns:pic="http://schemas.openxmlformats.org/drawingml/2006/picture">
-            <wp:extent cx="2509738" cy="7200000"/>
+            <wp:extent cx="2635225" cy="7560000"/>
             <wp:docPr id="4" name="Picture 4"/>
             <wp:cNvGraphicFramePr>
               <a:graphicFrameLocks noChangeAspect="1"/>
@@ -238,7 +175,7 @@
                     <pic:cNvPicPr/>
                   </pic:nvPicPr>
                   <pic:blipFill>
-                    <a:blip r:embed="rId12"/>
+                    <a:blip r:embed="rId20"/>
                     <a:stretch>
                       <a:fillRect/>
                     </a:stretch>
@@ -246,7 +183,7 @@
                   <pic:spPr>
                     <a:xfrm>
                       <a:off x="0" y="0"/>
-                      <a:ext cx="2509738" cy="7200000"/>
+                      <a:ext cx="2635225" cy="7560000"/>
                     </a:xfrm>
                     <a:prstGeom prst="rect"/>
                   </pic:spPr>
@@ -259,32 +196,15 @@
     </w:p>
     <w:p>
       <w:pPr>
-        <w:jc w:val="center"/>
+        <w:sectPr>
+          <w:headerReference w:type="default" r:id="rId18"/>
+          <w:footerReference w:type="default" r:id="rId19"/>
+          <w:pgSz w:w="11906" w:h="16838"/>
+          <w:pgMar w:top="1417" w:right="850" w:bottom="567" w:left="1417" w:header="720" w:footer="720" w:gutter="0"/>
+          <w:cols w:space="720"/>
+          <w:docGrid w:linePitch="360"/>
+        </w:sectPr>
       </w:pPr>
-      <w:r>
-        <w:rPr>
-          <w:rFonts w:ascii="Arial" w:hAnsi="Arial"/>
-          <w:sz w:val="24"/>
-        </w:rPr>
-        <w:t>Fig. 4</w:t>
-      </w:r>
-    </w:p>
-    <w:p>
-      <w:r>
-        <w:br w:type="page"/>
-      </w:r>
-    </w:p>
-    <w:p>
-      <w:pPr>
-        <w:jc w:val="right"/>
-      </w:pPr>
-      <w:r>
-        <w:rPr>
-          <w:rFonts w:ascii="Arial" w:hAnsi="Arial"/>
-          <w:sz w:val="24"/>
-        </w:rPr>
-        <w:t>5/6</w:t>
-      </w:r>
     </w:p>
     <w:p>
       <w:pPr>
@@ -293,7 +213,7 @@
       <w:r>
         <w:drawing>
           <wp:inline xmlns:a="http://schemas.openxmlformats.org/drawingml/2006/main" xmlns:pic="http://schemas.openxmlformats.org/drawingml/2006/picture">
-            <wp:extent cx="5760000" cy="2630204"/>
+            <wp:extent cx="5940000" cy="2712397"/>
             <wp:docPr id="5" name="Picture 5"/>
             <wp:cNvGraphicFramePr>
               <a:graphicFrameLocks noChangeAspect="1"/>
@@ -306,7 +226,7 @@
                     <pic:cNvPicPr/>
                   </pic:nvPicPr>
                   <pic:blipFill>
-                    <a:blip r:embed="rId13"/>
+                    <a:blip r:embed="rId23"/>
                     <a:stretch>
                       <a:fillRect/>
                     </a:stretch>
@@ -314,7 +234,7 @@
                   <pic:spPr>
                     <a:xfrm>
                       <a:off x="0" y="0"/>
-                      <a:ext cx="5760000" cy="2630204"/>
+                      <a:ext cx="5940000" cy="2712397"/>
                     </a:xfrm>
                     <a:prstGeom prst="rect"/>
                   </pic:spPr>
@@ -327,32 +247,15 @@
     </w:p>
     <w:p>
       <w:pPr>
-        <w:jc w:val="center"/>
+        <w:sectPr>
+          <w:headerReference w:type="default" r:id="rId21"/>
+          <w:footerReference w:type="default" r:id="rId22"/>
+          <w:pgSz w:w="11906" w:h="16838"/>
+          <w:pgMar w:top="1417" w:right="850" w:bottom="567" w:left="1417" w:header="720" w:footer="720" w:gutter="0"/>
+          <w:cols w:space="720"/>
+          <w:docGrid w:linePitch="360"/>
+        </w:sectPr>
       </w:pPr>
-      <w:r>
-        <w:rPr>
-          <w:rFonts w:ascii="Arial" w:hAnsi="Arial"/>
-          <w:sz w:val="24"/>
-        </w:rPr>
-        <w:t>Fig. 5</w:t>
-      </w:r>
-    </w:p>
-    <w:p>
-      <w:r>
-        <w:br w:type="page"/>
-      </w:r>
-    </w:p>
-    <w:p>
-      <w:pPr>
-        <w:jc w:val="right"/>
-      </w:pPr>
-      <w:r>
-        <w:rPr>
-          <w:rFonts w:ascii="Arial" w:hAnsi="Arial"/>
-          <w:sz w:val="24"/>
-        </w:rPr>
-        <w:t>6/6</w:t>
-      </w:r>
     </w:p>
     <w:p>
       <w:pPr>
@@ -361,7 +264,7 @@
       <w:r>
         <w:drawing>
           <wp:inline xmlns:a="http://schemas.openxmlformats.org/drawingml/2006/main" xmlns:pic="http://schemas.openxmlformats.org/drawingml/2006/picture">
-            <wp:extent cx="1873082" cy="7200000"/>
+            <wp:extent cx="1966736" cy="7560000"/>
             <wp:docPr id="6" name="Picture 6"/>
             <wp:cNvGraphicFramePr>
               <a:graphicFrameLocks noChangeAspect="1"/>
@@ -374,7 +277,7 @@
                     <pic:cNvPicPr/>
                   </pic:nvPicPr>
                   <pic:blipFill>
-                    <a:blip r:embed="rId14"/>
+                    <a:blip r:embed="rId26"/>
                     <a:stretch>
                       <a:fillRect/>
                     </a:stretch>
@@ -382,7 +285,7 @@
                   <pic:spPr>
                     <a:xfrm>
                       <a:off x="0" y="0"/>
-                      <a:ext cx="1873082" cy="7200000"/>
+                      <a:ext cx="1966736" cy="7560000"/>
                     </a:xfrm>
                     <a:prstGeom prst="rect"/>
                   </pic:spPr>
@@ -393,19 +296,9 @@
         </w:drawing>
       </w:r>
     </w:p>
-    <w:p>
-      <w:pPr>
-        <w:jc w:val="center"/>
-      </w:pPr>
-      <w:r>
-        <w:rPr>
-          <w:rFonts w:ascii="Arial" w:hAnsi="Arial"/>
-          <w:sz w:val="24"/>
-        </w:rPr>
-        <w:t>Fig. 6</w:t>
-      </w:r>
-    </w:p>
     <w:sectPr>
+      <w:headerReference w:type="default" r:id="rId24"/>
+      <w:footerReference w:type="default" r:id="rId25"/>
       <w:pgSz w:w="11906" w:h="16838"/>
       <w:pgMar w:top="1417" w:right="850" w:bottom="567" w:left="1417" w:header="720" w:footer="720" w:gutter="0"/>
       <w:cols w:space="720"/>
@@ -413,6 +306,234 @@
     </w:sectPr>
   </w:body>
 </w:document>
+</file>
+
+<file path=word/footer1.xml><?xml version="1.0" encoding="utf-8"?>
+<w:ftr xmlns:m="http://schemas.openxmlformats.org/officeDocument/2006/math" xmlns:mc="http://schemas.openxmlformats.org/markup-compatibility/2006" xmlns:mo="http://schemas.microsoft.com/office/mac/office/2008/main" xmlns:mv="urn:schemas-microsoft-com:mac:vml" xmlns:o="urn:schemas-microsoft-com:office:office" xmlns:r="http://schemas.openxmlformats.org/officeDocument/2006/relationships" xmlns:v="urn:schemas-microsoft-com:vml" xmlns:w10="urn:schemas-microsoft-com:office:word" xmlns:w14="http://schemas.microsoft.com/office/word/2010/wordml" xmlns:w="http://schemas.openxmlformats.org/wordprocessingml/2006/main" xmlns:wne="http://schemas.microsoft.com/office/word/2006/wordml" xmlns:wp14="http://schemas.microsoft.com/office/word/2010/wordprocessingDrawing" xmlns:wp="http://schemas.openxmlformats.org/drawingml/2006/wordprocessingDrawing" xmlns:wpc="http://schemas.microsoft.com/office/word/2010/wordprocessingCanvas" xmlns:wpg="http://schemas.microsoft.com/office/word/2010/wordprocessingGroup" xmlns:wpi="http://schemas.microsoft.com/office/word/2010/wordprocessingInk" xmlns:wps="http://schemas.microsoft.com/office/word/2010/wordprocessingShape" mc:Ignorable="w14 wp14">
+  <w:p>
+    <w:pPr>
+      <w:pStyle w:val="Footer"/>
+      <w:jc w:val="center"/>
+    </w:pPr>
+    <w:r/>
+    <w:r>
+      <w:rPr>
+        <w:rFonts w:ascii="Arial" w:hAnsi="Arial"/>
+        <w:sz w:val="24"/>
+      </w:rPr>
+      <w:t>Fig. 1</w:t>
+    </w:r>
+  </w:p>
+</w:ftr>
+</file>
+
+<file path=word/footer2.xml><?xml version="1.0" encoding="utf-8"?>
+<w:ftr xmlns:m="http://schemas.openxmlformats.org/officeDocument/2006/math" xmlns:mc="http://schemas.openxmlformats.org/markup-compatibility/2006" xmlns:mo="http://schemas.microsoft.com/office/mac/office/2008/main" xmlns:mv="urn:schemas-microsoft-com:mac:vml" xmlns:o="urn:schemas-microsoft-com:office:office" xmlns:r="http://schemas.openxmlformats.org/officeDocument/2006/relationships" xmlns:v="urn:schemas-microsoft-com:vml" xmlns:w10="urn:schemas-microsoft-com:office:word" xmlns:w14="http://schemas.microsoft.com/office/word/2010/wordml" xmlns:w="http://schemas.openxmlformats.org/wordprocessingml/2006/main" xmlns:wne="http://schemas.microsoft.com/office/word/2006/wordml" xmlns:wp14="http://schemas.microsoft.com/office/word/2010/wordprocessingDrawing" xmlns:wp="http://schemas.openxmlformats.org/drawingml/2006/wordprocessingDrawing" xmlns:wpc="http://schemas.microsoft.com/office/word/2010/wordprocessingCanvas" xmlns:wpg="http://schemas.microsoft.com/office/word/2010/wordprocessingGroup" xmlns:wpi="http://schemas.microsoft.com/office/word/2010/wordprocessingInk" xmlns:wps="http://schemas.microsoft.com/office/word/2010/wordprocessingShape" mc:Ignorable="w14 wp14">
+  <w:p>
+    <w:pPr>
+      <w:pStyle w:val="Footer"/>
+      <w:jc w:val="center"/>
+    </w:pPr>
+    <w:r/>
+    <w:r>
+      <w:rPr>
+        <w:rFonts w:ascii="Arial" w:hAnsi="Arial"/>
+        <w:sz w:val="24"/>
+      </w:rPr>
+      <w:t>Fig. 2</w:t>
+    </w:r>
+  </w:p>
+</w:ftr>
+</file>
+
+<file path=word/footer3.xml><?xml version="1.0" encoding="utf-8"?>
+<w:ftr xmlns:m="http://schemas.openxmlformats.org/officeDocument/2006/math" xmlns:mc="http://schemas.openxmlformats.org/markup-compatibility/2006" xmlns:mo="http://schemas.microsoft.com/office/mac/office/2008/main" xmlns:mv="urn:schemas-microsoft-com:mac:vml" xmlns:o="urn:schemas-microsoft-com:office:office" xmlns:r="http://schemas.openxmlformats.org/officeDocument/2006/relationships" xmlns:v="urn:schemas-microsoft-com:vml" xmlns:w10="urn:schemas-microsoft-com:office:word" xmlns:w14="http://schemas.microsoft.com/office/word/2010/wordml" xmlns:w="http://schemas.openxmlformats.org/wordprocessingml/2006/main" xmlns:wne="http://schemas.microsoft.com/office/word/2006/wordml" xmlns:wp14="http://schemas.microsoft.com/office/word/2010/wordprocessingDrawing" xmlns:wp="http://schemas.openxmlformats.org/drawingml/2006/wordprocessingDrawing" xmlns:wpc="http://schemas.microsoft.com/office/word/2010/wordprocessingCanvas" xmlns:wpg="http://schemas.microsoft.com/office/word/2010/wordprocessingGroup" xmlns:wpi="http://schemas.microsoft.com/office/word/2010/wordprocessingInk" xmlns:wps="http://schemas.microsoft.com/office/word/2010/wordprocessingShape" mc:Ignorable="w14 wp14">
+  <w:p>
+    <w:pPr>
+      <w:pStyle w:val="Footer"/>
+      <w:jc w:val="center"/>
+    </w:pPr>
+    <w:r/>
+    <w:r>
+      <w:rPr>
+        <w:rFonts w:ascii="Arial" w:hAnsi="Arial"/>
+        <w:sz w:val="24"/>
+      </w:rPr>
+      <w:t>Fig. 3</w:t>
+    </w:r>
+  </w:p>
+</w:ftr>
+</file>
+
+<file path=word/footer4.xml><?xml version="1.0" encoding="utf-8"?>
+<w:ftr xmlns:m="http://schemas.openxmlformats.org/officeDocument/2006/math" xmlns:mc="http://schemas.openxmlformats.org/markup-compatibility/2006" xmlns:mo="http://schemas.microsoft.com/office/mac/office/2008/main" xmlns:mv="urn:schemas-microsoft-com:mac:vml" xmlns:o="urn:schemas-microsoft-com:office:office" xmlns:r="http://schemas.openxmlformats.org/officeDocument/2006/relationships" xmlns:v="urn:schemas-microsoft-com:vml" xmlns:w10="urn:schemas-microsoft-com:office:word" xmlns:w14="http://schemas.microsoft.com/office/word/2010/wordml" xmlns:w="http://schemas.openxmlformats.org/wordprocessingml/2006/main" xmlns:wne="http://schemas.microsoft.com/office/word/2006/wordml" xmlns:wp14="http://schemas.microsoft.com/office/word/2010/wordprocessingDrawing" xmlns:wp="http://schemas.openxmlformats.org/drawingml/2006/wordprocessingDrawing" xmlns:wpc="http://schemas.microsoft.com/office/word/2010/wordprocessingCanvas" xmlns:wpg="http://schemas.microsoft.com/office/word/2010/wordprocessingGroup" xmlns:wpi="http://schemas.microsoft.com/office/word/2010/wordprocessingInk" xmlns:wps="http://schemas.microsoft.com/office/word/2010/wordprocessingShape" mc:Ignorable="w14 wp14">
+  <w:p>
+    <w:pPr>
+      <w:pStyle w:val="Footer"/>
+      <w:jc w:val="center"/>
+    </w:pPr>
+    <w:r/>
+    <w:r>
+      <w:rPr>
+        <w:rFonts w:ascii="Arial" w:hAnsi="Arial"/>
+        <w:sz w:val="24"/>
+      </w:rPr>
+      <w:t>Fig. 4</w:t>
+    </w:r>
+  </w:p>
+</w:ftr>
+</file>
+
+<file path=word/footer5.xml><?xml version="1.0" encoding="utf-8"?>
+<w:ftr xmlns:m="http://schemas.openxmlformats.org/officeDocument/2006/math" xmlns:mc="http://schemas.openxmlformats.org/markup-compatibility/2006" xmlns:mo="http://schemas.microsoft.com/office/mac/office/2008/main" xmlns:mv="urn:schemas-microsoft-com:mac:vml" xmlns:o="urn:schemas-microsoft-com:office:office" xmlns:r="http://schemas.openxmlformats.org/officeDocument/2006/relationships" xmlns:v="urn:schemas-microsoft-com:vml" xmlns:w10="urn:schemas-microsoft-com:office:word" xmlns:w14="http://schemas.microsoft.com/office/word/2010/wordml" xmlns:w="http://schemas.openxmlformats.org/wordprocessingml/2006/main" xmlns:wne="http://schemas.microsoft.com/office/word/2006/wordml" xmlns:wp14="http://schemas.microsoft.com/office/word/2010/wordprocessingDrawing" xmlns:wp="http://schemas.openxmlformats.org/drawingml/2006/wordprocessingDrawing" xmlns:wpc="http://schemas.microsoft.com/office/word/2010/wordprocessingCanvas" xmlns:wpg="http://schemas.microsoft.com/office/word/2010/wordprocessingGroup" xmlns:wpi="http://schemas.microsoft.com/office/word/2010/wordprocessingInk" xmlns:wps="http://schemas.microsoft.com/office/word/2010/wordprocessingShape" mc:Ignorable="w14 wp14">
+  <w:p>
+    <w:pPr>
+      <w:pStyle w:val="Footer"/>
+      <w:jc w:val="center"/>
+    </w:pPr>
+    <w:r/>
+    <w:r>
+      <w:rPr>
+        <w:rFonts w:ascii="Arial" w:hAnsi="Arial"/>
+        <w:sz w:val="24"/>
+      </w:rPr>
+      <w:t>Fig. 5</w:t>
+    </w:r>
+  </w:p>
+</w:ftr>
+</file>
+
+<file path=word/footer6.xml><?xml version="1.0" encoding="utf-8"?>
+<w:ftr xmlns:m="http://schemas.openxmlformats.org/officeDocument/2006/math" xmlns:mc="http://schemas.openxmlformats.org/markup-compatibility/2006" xmlns:mo="http://schemas.microsoft.com/office/mac/office/2008/main" xmlns:mv="urn:schemas-microsoft-com:mac:vml" xmlns:o="urn:schemas-microsoft-com:office:office" xmlns:r="http://schemas.openxmlformats.org/officeDocument/2006/relationships" xmlns:v="urn:schemas-microsoft-com:vml" xmlns:w10="urn:schemas-microsoft-com:office:word" xmlns:w14="http://schemas.microsoft.com/office/word/2010/wordml" xmlns:w="http://schemas.openxmlformats.org/wordprocessingml/2006/main" xmlns:wne="http://schemas.microsoft.com/office/word/2006/wordml" xmlns:wp14="http://schemas.microsoft.com/office/word/2010/wordprocessingDrawing" xmlns:wp="http://schemas.openxmlformats.org/drawingml/2006/wordprocessingDrawing" xmlns:wpc="http://schemas.microsoft.com/office/word/2010/wordprocessingCanvas" xmlns:wpg="http://schemas.microsoft.com/office/word/2010/wordprocessingGroup" xmlns:wpi="http://schemas.microsoft.com/office/word/2010/wordprocessingInk" xmlns:wps="http://schemas.microsoft.com/office/word/2010/wordprocessingShape" mc:Ignorable="w14 wp14">
+  <w:p>
+    <w:pPr>
+      <w:pStyle w:val="Footer"/>
+      <w:jc w:val="center"/>
+    </w:pPr>
+    <w:r/>
+    <w:r>
+      <w:rPr>
+        <w:rFonts w:ascii="Arial" w:hAnsi="Arial"/>
+        <w:sz w:val="24"/>
+      </w:rPr>
+      <w:t>Fig. 6</w:t>
+    </w:r>
+  </w:p>
+</w:ftr>
+</file>
+
+<file path=word/header1.xml><?xml version="1.0" encoding="utf-8"?>
+<w:hdr xmlns:m="http://schemas.openxmlformats.org/officeDocument/2006/math" xmlns:mc="http://schemas.openxmlformats.org/markup-compatibility/2006" xmlns:mo="http://schemas.microsoft.com/office/mac/office/2008/main" xmlns:mv="urn:schemas-microsoft-com:mac:vml" xmlns:o="urn:schemas-microsoft-com:office:office" xmlns:r="http://schemas.openxmlformats.org/officeDocument/2006/relationships" xmlns:v="urn:schemas-microsoft-com:vml" xmlns:w10="urn:schemas-microsoft-com:office:word" xmlns:w14="http://schemas.microsoft.com/office/word/2010/wordml" xmlns:w="http://schemas.openxmlformats.org/wordprocessingml/2006/main" xmlns:wne="http://schemas.microsoft.com/office/word/2006/wordml" xmlns:wp14="http://schemas.microsoft.com/office/word/2010/wordprocessingDrawing" xmlns:wp="http://schemas.openxmlformats.org/drawingml/2006/wordprocessingDrawing" xmlns:wpc="http://schemas.microsoft.com/office/word/2010/wordprocessingCanvas" xmlns:wpg="http://schemas.microsoft.com/office/word/2010/wordprocessingGroup" xmlns:wpi="http://schemas.microsoft.com/office/word/2010/wordprocessingInk" xmlns:wps="http://schemas.microsoft.com/office/word/2010/wordprocessingShape" mc:Ignorable="w14 wp14">
+  <w:p>
+    <w:pPr>
+      <w:pStyle w:val="Header"/>
+      <w:jc w:val="right"/>
+    </w:pPr>
+    <w:r/>
+    <w:r>
+      <w:rPr>
+        <w:rFonts w:ascii="Arial" w:hAnsi="Arial"/>
+        <w:sz w:val="24"/>
+      </w:rPr>
+      <w:t>1/6</w:t>
+    </w:r>
+  </w:p>
+</w:hdr>
+</file>
+
+<file path=word/header2.xml><?xml version="1.0" encoding="utf-8"?>
+<w:hdr xmlns:m="http://schemas.openxmlformats.org/officeDocument/2006/math" xmlns:mc="http://schemas.openxmlformats.org/markup-compatibility/2006" xmlns:mo="http://schemas.microsoft.com/office/mac/office/2008/main" xmlns:mv="urn:schemas-microsoft-com:mac:vml" xmlns:o="urn:schemas-microsoft-com:office:office" xmlns:r="http://schemas.openxmlformats.org/officeDocument/2006/relationships" xmlns:v="urn:schemas-microsoft-com:vml" xmlns:w10="urn:schemas-microsoft-com:office:word" xmlns:w14="http://schemas.microsoft.com/office/word/2010/wordml" xmlns:w="http://schemas.openxmlformats.org/wordprocessingml/2006/main" xmlns:wne="http://schemas.microsoft.com/office/word/2006/wordml" xmlns:wp14="http://schemas.microsoft.com/office/word/2010/wordprocessingDrawing" xmlns:wp="http://schemas.openxmlformats.org/drawingml/2006/wordprocessingDrawing" xmlns:wpc="http://schemas.microsoft.com/office/word/2010/wordprocessingCanvas" xmlns:wpg="http://schemas.microsoft.com/office/word/2010/wordprocessingGroup" xmlns:wpi="http://schemas.microsoft.com/office/word/2010/wordprocessingInk" xmlns:wps="http://schemas.microsoft.com/office/word/2010/wordprocessingShape" mc:Ignorable="w14 wp14">
+  <w:p>
+    <w:pPr>
+      <w:pStyle w:val="Header"/>
+      <w:jc w:val="right"/>
+    </w:pPr>
+    <w:r/>
+    <w:r>
+      <w:rPr>
+        <w:rFonts w:ascii="Arial" w:hAnsi="Arial"/>
+        <w:sz w:val="24"/>
+      </w:rPr>
+      <w:t>2/6</w:t>
+    </w:r>
+  </w:p>
+</w:hdr>
+</file>
+
+<file path=word/header3.xml><?xml version="1.0" encoding="utf-8"?>
+<w:hdr xmlns:m="http://schemas.openxmlformats.org/officeDocument/2006/math" xmlns:mc="http://schemas.openxmlformats.org/markup-compatibility/2006" xmlns:mo="http://schemas.microsoft.com/office/mac/office/2008/main" xmlns:mv="urn:schemas-microsoft-com:mac:vml" xmlns:o="urn:schemas-microsoft-com:office:office" xmlns:r="http://schemas.openxmlformats.org/officeDocument/2006/relationships" xmlns:v="urn:schemas-microsoft-com:vml" xmlns:w10="urn:schemas-microsoft-com:office:word" xmlns:w14="http://schemas.microsoft.com/office/word/2010/wordml" xmlns:w="http://schemas.openxmlformats.org/wordprocessingml/2006/main" xmlns:wne="http://schemas.microsoft.com/office/word/2006/wordml" xmlns:wp14="http://schemas.microsoft.com/office/word/2010/wordprocessingDrawing" xmlns:wp="http://schemas.openxmlformats.org/drawingml/2006/wordprocessingDrawing" xmlns:wpc="http://schemas.microsoft.com/office/word/2010/wordprocessingCanvas" xmlns:wpg="http://schemas.microsoft.com/office/word/2010/wordprocessingGroup" xmlns:wpi="http://schemas.microsoft.com/office/word/2010/wordprocessingInk" xmlns:wps="http://schemas.microsoft.com/office/word/2010/wordprocessingShape" mc:Ignorable="w14 wp14">
+  <w:p>
+    <w:pPr>
+      <w:pStyle w:val="Header"/>
+      <w:jc w:val="right"/>
+    </w:pPr>
+    <w:r/>
+    <w:r>
+      <w:rPr>
+        <w:rFonts w:ascii="Arial" w:hAnsi="Arial"/>
+        <w:sz w:val="24"/>
+      </w:rPr>
+      <w:t>3/6</w:t>
+    </w:r>
+  </w:p>
+</w:hdr>
+</file>
+
+<file path=word/header4.xml><?xml version="1.0" encoding="utf-8"?>
+<w:hdr xmlns:m="http://schemas.openxmlformats.org/officeDocument/2006/math" xmlns:mc="http://schemas.openxmlformats.org/markup-compatibility/2006" xmlns:mo="http://schemas.microsoft.com/office/mac/office/2008/main" xmlns:mv="urn:schemas-microsoft-com:mac:vml" xmlns:o="urn:schemas-microsoft-com:office:office" xmlns:r="http://schemas.openxmlformats.org/officeDocument/2006/relationships" xmlns:v="urn:schemas-microsoft-com:vml" xmlns:w10="urn:schemas-microsoft-com:office:word" xmlns:w14="http://schemas.microsoft.com/office/word/2010/wordml" xmlns:w="http://schemas.openxmlformats.org/wordprocessingml/2006/main" xmlns:wne="http://schemas.microsoft.com/office/word/2006/wordml" xmlns:wp14="http://schemas.microsoft.com/office/word/2010/wordprocessingDrawing" xmlns:wp="http://schemas.openxmlformats.org/drawingml/2006/wordprocessingDrawing" xmlns:wpc="http://schemas.microsoft.com/office/word/2010/wordprocessingCanvas" xmlns:wpg="http://schemas.microsoft.com/office/word/2010/wordprocessingGroup" xmlns:wpi="http://schemas.microsoft.com/office/word/2010/wordprocessingInk" xmlns:wps="http://schemas.microsoft.com/office/word/2010/wordprocessingShape" mc:Ignorable="w14 wp14">
+  <w:p>
+    <w:pPr>
+      <w:pStyle w:val="Header"/>
+      <w:jc w:val="right"/>
+    </w:pPr>
+    <w:r/>
+    <w:r>
+      <w:rPr>
+        <w:rFonts w:ascii="Arial" w:hAnsi="Arial"/>
+        <w:sz w:val="24"/>
+      </w:rPr>
+      <w:t>4/6</w:t>
+    </w:r>
+  </w:p>
+</w:hdr>
+</file>
+
+<file path=word/header5.xml><?xml version="1.0" encoding="utf-8"?>
+<w:hdr xmlns:m="http://schemas.openxmlformats.org/officeDocument/2006/math" xmlns:mc="http://schemas.openxmlformats.org/markup-compatibility/2006" xmlns:mo="http://schemas.microsoft.com/office/mac/office/2008/main" xmlns:mv="urn:schemas-microsoft-com:mac:vml" xmlns:o="urn:schemas-microsoft-com:office:office" xmlns:r="http://schemas.openxmlformats.org/officeDocument/2006/relationships" xmlns:v="urn:schemas-microsoft-com:vml" xmlns:w10="urn:schemas-microsoft-com:office:word" xmlns:w14="http://schemas.microsoft.com/office/word/2010/wordml" xmlns:w="http://schemas.openxmlformats.org/wordprocessingml/2006/main" xmlns:wne="http://schemas.microsoft.com/office/word/2006/wordml" xmlns:wp14="http://schemas.microsoft.com/office/word/2010/wordprocessingDrawing" xmlns:wp="http://schemas.openxmlformats.org/drawingml/2006/wordprocessingDrawing" xmlns:wpc="http://schemas.microsoft.com/office/word/2010/wordprocessingCanvas" xmlns:wpg="http://schemas.microsoft.com/office/word/2010/wordprocessingGroup" xmlns:wpi="http://schemas.microsoft.com/office/word/2010/wordprocessingInk" xmlns:wps="http://schemas.microsoft.com/office/word/2010/wordprocessingShape" mc:Ignorable="w14 wp14">
+  <w:p>
+    <w:pPr>
+      <w:pStyle w:val="Header"/>
+      <w:jc w:val="right"/>
+    </w:pPr>
+    <w:r/>
+    <w:r>
+      <w:rPr>
+        <w:rFonts w:ascii="Arial" w:hAnsi="Arial"/>
+        <w:sz w:val="24"/>
+      </w:rPr>
+      <w:t>5/6</w:t>
+    </w:r>
+  </w:p>
+</w:hdr>
+</file>
+
+<file path=word/header6.xml><?xml version="1.0" encoding="utf-8"?>
+<w:hdr xmlns:m="http://schemas.openxmlformats.org/officeDocument/2006/math" xmlns:mc="http://schemas.openxmlformats.org/markup-compatibility/2006" xmlns:mo="http://schemas.microsoft.com/office/mac/office/2008/main" xmlns:mv="urn:schemas-microsoft-com:mac:vml" xmlns:o="urn:schemas-microsoft-com:office:office" xmlns:r="http://schemas.openxmlformats.org/officeDocument/2006/relationships" xmlns:v="urn:schemas-microsoft-com:vml" xmlns:w10="urn:schemas-microsoft-com:office:word" xmlns:w14="http://schemas.microsoft.com/office/word/2010/wordml" xmlns:w="http://schemas.openxmlformats.org/wordprocessingml/2006/main" xmlns:wne="http://schemas.microsoft.com/office/word/2006/wordml" xmlns:wp14="http://schemas.microsoft.com/office/word/2010/wordprocessingDrawing" xmlns:wp="http://schemas.openxmlformats.org/drawingml/2006/wordprocessingDrawing" xmlns:wpc="http://schemas.microsoft.com/office/word/2010/wordprocessingCanvas" xmlns:wpg="http://schemas.microsoft.com/office/word/2010/wordprocessingGroup" xmlns:wpi="http://schemas.microsoft.com/office/word/2010/wordprocessingInk" xmlns:wps="http://schemas.microsoft.com/office/word/2010/wordprocessingShape" mc:Ignorable="w14 wp14">
+  <w:p>
+    <w:pPr>
+      <w:pStyle w:val="Header"/>
+      <w:jc w:val="right"/>
+    </w:pPr>
+    <w:r/>
+    <w:r>
+      <w:rPr>
+        <w:rFonts w:ascii="Arial" w:hAnsi="Arial"/>
+        <w:sz w:val="24"/>
+      </w:rPr>
+      <w:t>6/6</w:t>
+    </w:r>
+  </w:p>
+</w:hdr>
 </file>
 
 <file path=word/numbering.xml><?xml version="1.0" encoding="utf-8"?>

</xml_diff>